<commit_message>
feat: initialize cafeteria core application architecture, database models, and administrative dashboard templates
</commit_message>
<xml_diff>
--- a/DOCUMENTACION_TECNICA.docx
+++ b/DOCUMENTACION_TECNICA.docx
@@ -66,7 +66,7 @@
           <w:b/>
           <w:color w:val="0F172A"/>
         </w:rPr>
-        <w:t>Documentación Técnica - CoffeeApp v2.0</w:t>
+        <w:t>Documentación Técnica - YUQUI v2.0</w:t>
       </w:r>
     </w:p>
     <w:p>
@@ -94,7 +94,7 @@
         <w:rPr>
           <w:b/>
         </w:rPr>
-        <w:t>CoffeeApp</w:t>
+        <w:t>YUQUI</w:t>
       </w:r>
       <w:r>
         <w:t>. Cubre la arquitectura, base de datos, flujos de negocio clave (SRI, Kárdex/Recetas) y lineamientos para desarrollo.</w:t>
@@ -127,7 +127,7 @@
         <w:spacing w:before="0" w:after="120" w:line="276" w:lineRule="auto"/>
       </w:pPr>
       <w:r>
-        <w:t xml:space="preserve">CoffeeApp está estructurado como una aplicación monolitica con diseño modular en capas utilizando </w:t>
+        <w:t xml:space="preserve">YUQUI está estructurado como una aplicación monolitica con diseño modular en capas utilizando </w:t>
       </w:r>
       <w:r>
         <w:rPr>
@@ -187,7 +187,7 @@
               <a:graphicData uri="http://schemas.openxmlformats.org/drawingml/2006/picture">
                 <pic:pic>
                   <pic:nvPicPr>
-                    <pic:cNvPr id="0" name="mermaid_-6542364475501412828.png"/>
+                    <pic:cNvPr id="0" name="mermaid_-8872889302364472873.png"/>
                     <pic:cNvPicPr/>
                   </pic:nvPicPr>
                   <pic:blipFill>
@@ -421,7 +421,7 @@
               <a:graphicData uri="http://schemas.openxmlformats.org/drawingml/2006/picture">
                 <pic:pic>
                   <pic:nvPicPr>
-                    <pic:cNvPr id="0" name="mermaid_-8794843281673441678.png"/>
+                    <pic:cNvPr id="0" name="mermaid_-5608595858381867860.png"/>
                     <pic:cNvPicPr/>
                   </pic:nvPicPr>
                   <pic:blipFill>
@@ -505,7 +505,7 @@
               <a:graphicData uri="http://schemas.openxmlformats.org/drawingml/2006/picture">
                 <pic:pic>
                   <pic:nvPicPr>
-                    <pic:cNvPr id="0" name="mermaid_-239739878455205309.png"/>
+                    <pic:cNvPr id="0" name="mermaid_6520807293589321138.png"/>
                     <pic:cNvPicPr/>
                   </pic:nvPicPr>
                   <pic:blipFill>
@@ -580,7 +580,7 @@
       <w:r>
         <w:drawing>
           <wp:inline xmlns:a="http://schemas.openxmlformats.org/drawingml/2006/main" xmlns:pic="http://schemas.openxmlformats.org/drawingml/2006/picture">
-            <wp:extent cx="5303520" cy="2034227"/>
+            <wp:extent cx="5303520" cy="4186142"/>
             <wp:docPr id="4" name="Picture 4"/>
             <wp:cNvGraphicFramePr>
               <a:graphicFrameLocks noChangeAspect="1"/>
@@ -589,7 +589,7 @@
               <a:graphicData uri="http://schemas.openxmlformats.org/drawingml/2006/picture">
                 <pic:pic>
                   <pic:nvPicPr>
-                    <pic:cNvPr id="0" name="mermaid_7526389003053638419.png"/>
+                    <pic:cNvPr id="0" name="mermaid_-7647585241549784151.png"/>
                     <pic:cNvPicPr/>
                   </pic:nvPicPr>
                   <pic:blipFill>
@@ -601,7 +601,7 @@
                   <pic:spPr>
                     <a:xfrm>
                       <a:off x="0" y="0"/>
-                      <a:ext cx="5303520" cy="2034227"/>
+                      <a:ext cx="5303520" cy="4186142"/>
                     </a:xfrm>
                     <a:prstGeom prst="rect"/>
                   </pic:spPr>
@@ -700,6 +700,174 @@
         <w:rPr>
           <w:b/>
         </w:rPr>
+        <w:t>Gestión Multiempresa (Multi-tenant) y Multipunto</w:t>
+      </w:r>
+      <w:r>
+        <w:t>:</w:t>
+      </w:r>
+    </w:p>
+    <w:p>
+      <w:pPr>
+        <w:spacing w:before="0" w:after="120" w:line="276" w:lineRule="auto"/>
+      </w:pPr>
+      <w:r>
+        <w:t>La cabecera de la venta (</w:t>
+      </w:r>
+      <w:r>
+        <w:rPr>
+          <w:rFonts w:ascii="Courier New" w:hAnsi="Courier New"/>
+          <w:color w:val="C7254E"/>
+          <w:sz w:val="19"/>
+        </w:rPr>
+        <w:t>Sale</w:t>
+      </w:r>
+      <w:r>
+        <w:t>) almacena la referencia a la empresa (</w:t>
+      </w:r>
+      <w:r>
+        <w:rPr>
+          <w:rFonts w:ascii="Courier New" w:hAnsi="Courier New"/>
+          <w:color w:val="C7254E"/>
+          <w:sz w:val="19"/>
+        </w:rPr>
+        <w:t>company_id</w:t>
+      </w:r>
+      <w:r>
+        <w:t>) y al punto de emisión (</w:t>
+      </w:r>
+      <w:r>
+        <w:rPr>
+          <w:rFonts w:ascii="Courier New" w:hAnsi="Courier New"/>
+          <w:color w:val="C7254E"/>
+          <w:sz w:val="19"/>
+        </w:rPr>
+        <w:t>emission_point_id</w:t>
+      </w:r>
+      <w:r>
+        <w:t xml:space="preserve">) seleccionados. Los datos fiscales (RUC, razón social, dirección matriz, ambiente) y la identidad de marca (personalidad, colores, logo) son recuperados dinámicamente del modelo </w:t>
+      </w:r>
+      <w:r>
+        <w:rPr>
+          <w:rFonts w:ascii="Courier New" w:hAnsi="Courier New"/>
+          <w:color w:val="C7254E"/>
+          <w:sz w:val="19"/>
+        </w:rPr>
+        <w:t>Company</w:t>
+      </w:r>
+      <w:r>
+        <w:t xml:space="preserve"> almacenado en la base de datos, en lugar de estar fijos en variables </w:t>
+      </w:r>
+      <w:r>
+        <w:rPr>
+          <w:rFonts w:ascii="Courier New" w:hAnsi="Courier New"/>
+          <w:color w:val="C7254E"/>
+          <w:sz w:val="19"/>
+        </w:rPr>
+        <w:t>.env</w:t>
+      </w:r>
+      <w:r>
+        <w:t>.</w:t>
+      </w:r>
+    </w:p>
+    <w:p>
+      <w:pPr>
+        <w:pStyle w:val="ListNumber"/>
+        <w:spacing w:before="0" w:after="50"/>
+      </w:pPr>
+      <w:r>
+        <w:rPr>
+          <w:b/>
+        </w:rPr>
+        <w:t>Generación de Secuenciales Strict</w:t>
+      </w:r>
+      <w:r>
+        <w:t>:</w:t>
+      </w:r>
+    </w:p>
+    <w:p>
+      <w:pPr>
+        <w:spacing w:before="0" w:after="120" w:line="276" w:lineRule="auto"/>
+      </w:pPr>
+      <w:r>
+        <w:t>El secuencial de la factura (</w:t>
+      </w:r>
+      <w:r>
+        <w:rPr>
+          <w:rFonts w:ascii="Courier New" w:hAnsi="Courier New"/>
+          <w:color w:val="C7254E"/>
+          <w:sz w:val="19"/>
+        </w:rPr>
+        <w:t>invoice_number</w:t>
+      </w:r>
+      <w:r>
+        <w:t xml:space="preserve">) se genera a partir del punto de emisión activo: </w:t>
+      </w:r>
+      <w:r>
+        <w:rPr>
+          <w:rFonts w:ascii="Courier New" w:hAnsi="Courier New"/>
+          <w:color w:val="C7254E"/>
+          <w:sz w:val="19"/>
+        </w:rPr>
+        <w:t>establecimiento - punto_emision - secuencial</w:t>
+      </w:r>
+      <w:r>
+        <w:t>. El secuencial se incrementa de forma secuencial y atómica por transacción de venta en el backend.</w:t>
+      </w:r>
+    </w:p>
+    <w:p>
+      <w:pPr>
+        <w:pStyle w:val="ListNumber"/>
+        <w:spacing w:before="0" w:after="50"/>
+      </w:pPr>
+      <w:r>
+        <w:rPr>
+          <w:b/>
+        </w:rPr>
+        <w:t>Determinación Dinámica de IVA por Periodos</w:t>
+      </w:r>
+      <w:r>
+        <w:t>:</w:t>
+      </w:r>
+    </w:p>
+    <w:p>
+      <w:pPr>
+        <w:spacing w:before="0" w:after="120" w:line="276" w:lineRule="auto"/>
+      </w:pPr>
+      <w:r>
+        <w:t xml:space="preserve">El porcentaje de impuesto se obtiene dinámicamente de la tabla </w:t>
+      </w:r>
+      <w:r>
+        <w:rPr>
+          <w:rFonts w:ascii="Courier New" w:hAnsi="Courier New"/>
+          <w:color w:val="C7254E"/>
+          <w:sz w:val="19"/>
+        </w:rPr>
+        <w:t>tax_parameters</w:t>
+      </w:r>
+      <w:r>
+        <w:t xml:space="preserve"> basado en la fecha de la venta (</w:t>
+      </w:r>
+      <w:r>
+        <w:rPr>
+          <w:rFonts w:ascii="Courier New" w:hAnsi="Courier New"/>
+          <w:color w:val="C7254E"/>
+          <w:sz w:val="19"/>
+        </w:rPr>
+        <w:t>sale_date</w:t>
+      </w:r>
+      <w:r>
+        <w:t>). El backend realiza una consulta para encontrar el parámetro de IVA activo y vigente para ese tramo de tiempo, permitiendo regularizaciones gubernamentales del SRI sin alterar la base histórica.</w:t>
+      </w:r>
+    </w:p>
+    <w:p>
+      <w:pPr>
+        <w:pStyle w:val="ListNumber"/>
+        <w:spacing w:before="0" w:after="50"/>
+      </w:pPr>
+      <w:r>
+        <w:rPr>
+          <w:b/>
+        </w:rPr>
         <w:t>Generación de la Clave de Acceso (49 dígitos)</w:t>
       </w:r>
       <w:r>
@@ -711,7 +879,7 @@
         <w:spacing w:before="0" w:after="120" w:line="276" w:lineRule="auto"/>
       </w:pPr>
       <w:r>
-        <w:t>Se construye concatenando la fecha, código de factura ("01"), RUC de la empresa (13 dígitos), ambiente ("1" o "2"), serie de emisión ("Establecimiento + Punto Emisión", e.g., "001001"), secuencial (9 dígitos), código numérico aleatorio (8 dígitos) y tipo de emisión ("1").</w:t>
+        <w:t>Se construye concatenando la fecha de emisión, código de factura ("01"), RUC de la empresa (13 dígitos), ambiente de la empresa ("1" o "2"), serie de emisión ("Establecimiento + Punto Emisión", e.g., "001001"), secuencial (9 dígitos), código numérico aleatorio (8 dígitos) y tipo de emisión ("1").</w:t>
       </w:r>
     </w:p>
     <w:p>
@@ -806,7 +974,7 @@
         <w:spacing w:before="0" w:after="120" w:line="276" w:lineRule="auto"/>
       </w:pPr>
       <w:r>
-        <w:t>Se compila un documento XML cumpliendo el esquema estándar de la ficha técnica SRI (v1.1.0).</w:t>
+        <w:t>Se compila un documento XML cumpliendo el esquema estándar de la ficha técnica SRI (v1.1.0). El código de porcentaje de IVA se asocia de forma dinámica (e.g., 2 para 12%, 4 para 15% según el estándar ecuatoriano).</w:t>
       </w:r>
     </w:p>
     <w:p>
@@ -851,7 +1019,7 @@
         <w:t>.p12</w:t>
       </w:r>
       <w:r>
-        <w:t>.</w:t>
+        <w:t xml:space="preserve"> cargados desde la base de datos de la empresa.</w:t>
       </w:r>
     </w:p>
     <w:p>

</xml_diff>

<commit_message>
feat: implement core ordering system with new UI templates, sales models, services, and billing router
</commit_message>
<xml_diff>
--- a/DOCUMENTACION_TECNICA.docx
+++ b/DOCUMENTACION_TECNICA.docx
@@ -178,7 +178,7 @@
       <w:r>
         <w:drawing>
           <wp:inline xmlns:a="http://schemas.openxmlformats.org/drawingml/2006/main" xmlns:pic="http://schemas.openxmlformats.org/drawingml/2006/picture">
-            <wp:extent cx="5303520" cy="1853361"/>
+            <wp:extent cx="5303520" cy="1882411"/>
             <wp:docPr id="1" name="Picture 1"/>
             <wp:cNvGraphicFramePr>
               <a:graphicFrameLocks noChangeAspect="1"/>
@@ -187,7 +187,7 @@
               <a:graphicData uri="http://schemas.openxmlformats.org/drawingml/2006/picture">
                 <pic:pic>
                   <pic:nvPicPr>
-                    <pic:cNvPr id="0" name="mermaid_-8872889302364472873.png"/>
+                    <pic:cNvPr id="0" name="mermaid_2914987892930836197.png"/>
                     <pic:cNvPicPr/>
                   </pic:nvPicPr>
                   <pic:blipFill>
@@ -199,7 +199,7 @@
                   <pic:spPr>
                     <a:xfrm>
                       <a:off x="0" y="0"/>
-                      <a:ext cx="5303520" cy="1853361"/>
+                      <a:ext cx="5303520" cy="1882411"/>
                     </a:xfrm>
                     <a:prstGeom prst="rect"/>
                   </pic:spPr>
@@ -421,7 +421,7 @@
               <a:graphicData uri="http://schemas.openxmlformats.org/drawingml/2006/picture">
                 <pic:pic>
                   <pic:nvPicPr>
-                    <pic:cNvPr id="0" name="mermaid_-5608595858381867860.png"/>
+                    <pic:cNvPr id="0" name="mermaid_-5590606882416073993.png"/>
                     <pic:cNvPicPr/>
                   </pic:nvPicPr>
                   <pic:blipFill>
@@ -505,7 +505,7 @@
               <a:graphicData uri="http://schemas.openxmlformats.org/drawingml/2006/picture">
                 <pic:pic>
                   <pic:nvPicPr>
-                    <pic:cNvPr id="0" name="mermaid_6520807293589321138.png"/>
+                    <pic:cNvPr id="0" name="mermaid_4148140409221035257.png"/>
                     <pic:cNvPicPr/>
                   </pic:nvPicPr>
                   <pic:blipFill>
@@ -580,7 +580,7 @@
       <w:r>
         <w:drawing>
           <wp:inline xmlns:a="http://schemas.openxmlformats.org/drawingml/2006/main" xmlns:pic="http://schemas.openxmlformats.org/drawingml/2006/picture">
-            <wp:extent cx="5303520" cy="4186142"/>
+            <wp:extent cx="5303520" cy="3431618"/>
             <wp:docPr id="4" name="Picture 4"/>
             <wp:cNvGraphicFramePr>
               <a:graphicFrameLocks noChangeAspect="1"/>
@@ -589,7 +589,7 @@
               <a:graphicData uri="http://schemas.openxmlformats.org/drawingml/2006/picture">
                 <pic:pic>
                   <pic:nvPicPr>
-                    <pic:cNvPr id="0" name="mermaid_-7647585241549784151.png"/>
+                    <pic:cNvPr id="0" name="mermaid_-1261492455303596340.png"/>
                     <pic:cNvPicPr/>
                   </pic:nvPicPr>
                   <pic:blipFill>
@@ -601,7 +601,7 @@
                   <pic:spPr>
                     <a:xfrm>
                       <a:off x="0" y="0"/>
-                      <a:ext cx="5303520" cy="4186142"/>
+                      <a:ext cx="5303520" cy="3431618"/>
                     </a:xfrm>
                     <a:prstGeom prst="rect"/>
                   </pic:spPr>
@@ -1247,6 +1247,107 @@
       </w:r>
       <w:r>
         <w:t xml:space="preserve"> persistiendo los valores anteriores y nuevos para auditorías forenses inmutables.</w:t>
+      </w:r>
+    </w:p>
+    <w:p>
+      <w:pPr>
+        <w:pStyle w:val="Heading3"/>
+        <w:keepNext/>
+        <w:spacing w:before="240" w:after="80"/>
+      </w:pPr>
+      <w:r>
+        <w:rPr>
+          <w:b/>
+          <w:color w:val="475569"/>
+        </w:rPr>
+        <w:t>5.4 Gestión de Retenciones, Anulación y Reportería SRI</w:t>
+      </w:r>
+    </w:p>
+    <w:p>
+      <w:pPr>
+        <w:spacing w:before="0" w:after="120" w:line="276" w:lineRule="auto"/>
+      </w:pPr>
+      <w:r>
+        <w:t>El sistema provee una gestión fiscal robusta adaptada al SRI de Ecuador:</w:t>
+      </w:r>
+    </w:p>
+    <w:p>
+      <w:pPr>
+        <w:pStyle w:val="ListBullet"/>
+        <w:spacing w:before="0" w:after="50"/>
+      </w:pPr>
+      <w:r>
+        <w:t>Pagos con Retenciones</w:t>
+      </w:r>
+      <w:r>
+        <w:rPr>
+          <w:b/>
+        </w:rPr>
+      </w:r>
+      <w:r>
+        <w:t>: Al registrar facturas, se capturan los detalles del comprobante físico de retención de IVA/Renta emitido por el cliente. El pago neto se calcula de forma automática deduciendo las retenciones, y se registra un pago contable compensatorio bajo el método "Retención" para asegurar el balance de la venta.</w:t>
+      </w:r>
+    </w:p>
+    <w:p>
+      <w:pPr>
+        <w:pStyle w:val="ListBullet"/>
+        <w:spacing w:before="0" w:after="50"/>
+      </w:pPr>
+      <w:r>
+        <w:t>Anulación con Notas de Crédito</w:t>
+      </w:r>
+      <w:r>
+        <w:rPr>
+          <w:b/>
+        </w:rPr>
+      </w:r>
+      <w:r>
+        <w:t>: Para dar de baja facturas autorizadas, el sistema genera automáticamente un comprobante electrónico de Nota de Crédito (código "04"), consume un secuencial dedicado del punto de emisión y calcula su clave de acceso SRI correspondiente.</w:t>
+      </w:r>
+    </w:p>
+    <w:p>
+      <w:pPr>
+        <w:pStyle w:val="ListBullet"/>
+        <w:spacing w:before="0" w:after="50"/>
+      </w:pPr>
+      <w:r>
+        <w:t>Reversión Automática de Stock</w:t>
+      </w:r>
+      <w:r>
+        <w:rPr>
+          <w:b/>
+        </w:rPr>
+      </w:r>
+      <w:r>
+        <w:t>: La anulación llama al servicio Kárdex para identificar los consumos originales por receta (BOM) o venta directa y emite movimientos de entrada (</w:t>
+      </w:r>
+      <w:r>
+        <w:rPr>
+          <w:rFonts w:ascii="Courier New" w:hAnsi="Courier New"/>
+          <w:color w:val="C7254E"/>
+          <w:sz w:val="19"/>
+        </w:rPr>
+        <w:t>IN</w:t>
+      </w:r>
+      <w:r>
+        <w:t>) compensatorios para reponer existencias en tiempo real.</w:t>
+      </w:r>
+    </w:p>
+    <w:p>
+      <w:pPr>
+        <w:pStyle w:val="ListBullet"/>
+        <w:spacing w:before="0" w:after="50"/>
+      </w:pPr>
+      <w:r>
+        <w:t>Reportes y Anexo ATS</w:t>
+      </w:r>
+      <w:r>
+        <w:rPr>
+          <w:b/>
+        </w:rPr>
+      </w:r>
+      <w:r>
+        <w:t>: El módulo consolida bases gravables por tarifa de IVA, desglosa comprobantes de retención recibidos y agrupa métricas por tipos de identificación del cliente (Cédula, RUC, CF) y códigos de pago oficiales del SRI para facilitar la declaración contable.</w:t>
       </w:r>
     </w:p>
     <w:p>

</xml_diff>